<commit_message>
updated for nf v26 support and bumped version to 1.3
</commit_message>
<xml_diff>
--- a/rnaseq-flow_User_Guide.docx
+++ b/rnaseq-flow_User_Guide.docx
@@ -1454,7 +1454,7 @@
         <w:t xml:space="preserve">Nextflow </w:t>
       </w:r>
       <w:r>
-        <w:t xml:space="preserve">version 22.10.1 or newer.</w:t>
+        <w:t xml:space="preserve">version 25.10.0 or newer (the pipeline uses the strict language, default from 25.10; verified on 26.04).</w:t>
       </w:r>
     </w:p>
     <w:p>
@@ -2150,7 +2150,7 @@
         <w:t xml:space="preserve">Reproducibility. </w:t>
       </w:r>
       <w:r>
-        <w:t xml:space="preserve">--download_release pins a specific Ensembl release (e.g. 102; a leading 'v' is accepted). The genome FASTA + GTF are then written to a versioned subfolder under --outdir - the example above produces references/human/v102/. Omit --download_release to fetch the rolling latest release straight into --outdir. The download_log.txt always records the exact release used.</w:t>
+        <w:t xml:space="preserve">--download_release pins a specific Ensembl release (e.g. 102; a leading 'v' is accepted). The reference files are then written to a versioned subfolder under --outdir - the example above produces references/human/v102/. Omit --download_release to resolve and fetch the latest release straight into --outdir. The download_log.txt always records the resolved release, the assembly name, all three filenames, and the exact --download_release value that reproduces the set.</w:t>
       </w:r>
     </w:p>
     <w:p>
@@ -2165,7 +2165,7 @@
         <w:t xml:space="preserve">Outputs </w:t>
       </w:r>
       <w:r>
-        <w:t xml:space="preserve">(under the versioned subfolder): the genome FASTA (.fa.gz), the annotation (.gtf.gz, whose name carries the release number), and a download_log.txt provenance file. With --download_gmt, a gmt/ folder of Hallmark, C2 (KEGG/Reactome) and C5 (GO) gene sets is written under --outdir.</w:t>
+        <w:t xml:space="preserve">(under the versioned subfolder): the genome FASTA (.dna.primary_assembly.fa.gz, or .dna.toplevel.fa.gz for species that publish no primary assembly), the annotation (.gtf.gz), the cDNA transcriptome (.cdna.all.fa.gz, which is what --transcript_fasta expects), and a download_log.txt provenance file. With --download_gmt, a gmt/ folder of Hallmark, C2 (KEGG/Reactome) and C5 (GO) gene sets is written under --outdir.</w:t>
       </w:r>
     </w:p>
     <w:p>
@@ -2185,7 +2185,27 @@
         <w:t xml:space="preserve">Note  </w:t>
       </w:r>
       <w:r>
-        <w:t xml:space="preserve">For a transcript FASTA (needed for Salmon/Kallisto or isoform switching), download the Ensembl cdna.all.fa.gz file for your species separately.</w:t>
+        <w:t xml:space="preserve">Which GTF? Ensembl publishes several annotations per species (abinitio, chr, chr_patch_hapl_scaff, and the canonical one). Only the canonical GTF describes the primary-assembly genome; the others add patch scaffolds and alternative haplotypes that have no matching sequence. The pipeline selects the GTF and the transcriptome by the assembly named in the genome FASTA, and fails loudly rather than guessing. Reference sets downloaded with rnaseq-flow before v1.2.0 used the patch/haplotype GTF and should be re-downloaded.</w:t>
+      </w:r>
+    </w:p>
+    <w:p>
+      <w:pPr>
+        <w:pBdr>
+          <w:left w:val="single" w:color="E0A800" w:sz="18" w:space="6"/>
+        </w:pBdr>
+        <w:shd w:fill="FFF4CE" w:val="clear"/>
+        <w:spacing w:after="140" w:before="80"/>
+        <w:ind w:left="160"/>
+      </w:pPr>
+      <w:r>
+        <w:rPr>
+          <w:b/>
+          <w:bCs/>
+        </w:rPr>
+        <w:t xml:space="preserve">Note  </w:t>
+      </w:r>
+      <w:r>
+        <w:t xml:space="preserve">Only the cDNA transcriptome is fetched. If your library is rRNA-depleted rather than poly-A selected, also index Ensembl's ncrna.fa.gz for that species, or lncRNAs go unquantified.</w:t>
       </w:r>
     </w:p>
     <w:p>

</xml_diff>